<commit_message>
Use conditional tags instead
</commit_message>
<xml_diff>
--- a/arches_her/docx/Opt out Implications Letter.docx
+++ b/arches_her/docx/Opt out Implications Letter.docx
@@ -710,6 +710,38 @@
     </w:p>
     <w:p>
       <w:pPr>
+        <w:tabs>
+          <w:tab w:val="left" w:pos="5245"/>
+        </w:tabs>
+        <w:spacing w:after="0" w:line="240" w:lineRule="auto"/>
+        <w:rPr>
+          <w:rFonts w:cstheme="minorHAnsi"/>
+        </w:rPr>
+      </w:pPr>
+      <w:r>
+        <w:rPr>
+          <w:rFonts w:cstheme="minorHAnsi"/>
+        </w:rPr>
+        <w:t>&lt;IF Archaeological Priority Area is not empty&gt;</w:t>
+      </w:r>
+      <w:r>
+        <w:rPr>
+          <w:rFonts w:cstheme="minorHAnsi"/>
+        </w:rPr>
+      </w:r>
+      <w:r>
+        <w:rPr>
+          <w:rFonts w:cstheme="minorHAnsi"/>
+        </w:rPr>
+      </w:r>
+      <w:r>
+        <w:rPr>
+          <w:rFonts w:cstheme="minorHAnsi"/>
+        </w:rPr>
+      </w:r>
+    </w:p>
+    <w:p>
+      <w:pPr>
         <w:spacing w:after="0" w:line="240" w:lineRule="auto"/>
       </w:pPr>
       <w:r>
@@ -724,19 +756,6 @@
     </w:p>
     <w:p>
       <w:pPr>
-        <w:spacing w:after="0" w:line="240" w:lineRule="auto"/>
-      </w:pPr>
-    </w:p>
-    <w:p>
-      <w:r>
-        <w:t>Even though this planning application is not located within an Archaeological Priority Area it is of a nature and of sufficient scale that its effect on heritage assets of archaeological interest should be assessed</w:t>
-      </w:r>
-      <w:r>
-        <w:t>.</w:t>
-      </w:r>
-    </w:p>
-    <w:p>
-      <w:pPr>
         <w:tabs>
           <w:tab w:val="left" w:pos="5245"/>
         </w:tabs>
@@ -745,14 +764,81 @@
           <w:rFonts w:cstheme="minorHAnsi"/>
         </w:rPr>
       </w:pPr>
-      <w:bookmarkStart w:id="0" w:name="_Hlk118981492"/>
       <w:r>
         <w:rPr>
           <w:rFonts w:cstheme="minorHAnsi"/>
         </w:rPr>
+        <w:t>&lt;ELSE&gt;</w:t>
+      </w:r>
+      <w:r>
+        <w:rPr>
+          <w:rFonts w:cstheme="minorHAnsi"/>
+        </w:rPr>
+      </w:r>
+      <w:r>
+        <w:rPr>
+          <w:rFonts w:cstheme="minorHAnsi"/>
+        </w:rPr>
+      </w:r>
+    </w:p>
+    <w:p>
+      <w:pPr>
+        <w:tabs>
+          <w:tab w:val="left" w:pos="5245"/>
+        </w:tabs>
+        <w:spacing w:after="0" w:line="240" w:lineRule="auto"/>
+      </w:pPr>
+      <w:r>
+        <w:t>Even though this planning application is not located within an Archaeological Priority Area it is of a nature and of sufficient scale that its effect on heritage assets of archaeological interest should be assessed.</w:t>
+      </w:r>
+    </w:p>
+    <w:p>
+      <w:pPr>
+        <w:tabs>
+          <w:tab w:val="left" w:pos="5245"/>
+        </w:tabs>
+        <w:spacing w:after="0" w:line="240" w:lineRule="auto"/>
+        <w:rPr>
+          <w:rFonts w:cstheme="minorHAnsi"/>
+        </w:rPr>
+      </w:pPr>
+      <w:r>
+        <w:rPr>
+          <w:rFonts w:cstheme="minorHAnsi"/>
+        </w:rPr>
+        <w:t>&lt;END IF&gt;</w:t>
+      </w:r>
+      <w:r>
+        <w:rPr>
+          <w:rFonts w:cstheme="minorHAnsi"/>
+        </w:rPr>
+      </w:r>
+      <w:r>
+        <w:rPr>
+          <w:rFonts w:cstheme="minorHAnsi"/>
+        </w:rPr>
+      </w:r>
+    </w:p>
+    <w:p>
+      <w:pPr>
+        <w:tabs>
+          <w:tab w:val="left" w:pos="5245"/>
+        </w:tabs>
+        <w:spacing w:after="0" w:line="240" w:lineRule="auto"/>
+      </w:pPr>
+    </w:p>
+    <w:p>
+      <w:pPr>
+        <w:tabs>
+          <w:tab w:val="left" w:pos="5245"/>
+        </w:tabs>
+        <w:spacing w:after="0" w:line="240" w:lineRule="auto"/>
+      </w:pPr>
+      <w:r>
         <w:t>&lt;Assessment of Significance&gt;</w:t>
       </w:r>
-      <w:bookmarkEnd w:id="0"/>
+      <w:r/>
+      <w:r/>
     </w:p>
     <w:p>
       <w:pPr>
@@ -928,7 +1014,21 @@
         <w:rPr>
           <w:rFonts w:eastAsia="Arial"/>
         </w:rPr>
-        <w:t xml:space="preserve"> that heritage assets should be conserved in a manner appropriate to their significance, and that development proposals should take into account the positive contributions heritage assets can make to sustainable communities and to places.  </w:t>
+        <w:t xml:space="preserve"> that heritage assets should be conserved in a manner appropriate to their significance, and that development proposals should </w:t>
+      </w:r>
+      <w:proofErr w:type="gramStart"/>
+      <w:r>
+        <w:rPr>
+          <w:rFonts w:eastAsia="Arial"/>
+        </w:rPr>
+        <w:t>take into account</w:t>
+      </w:r>
+      <w:proofErr w:type="gramEnd"/>
+      <w:r>
+        <w:rPr>
+          <w:rFonts w:eastAsia="Arial"/>
+        </w:rPr>
+        <w:t xml:space="preserve"> the positive contributions heritage assets can make to sustainable communities and to places.  </w:t>
       </w:r>
       <w:r>
         <w:t xml:space="preserve"> </w:t>
@@ -950,33 +1050,49 @@
         <w:spacing w:after="0" w:line="240" w:lineRule="auto"/>
       </w:pPr>
       <w:r>
+        <w:lastRenderedPageBreak/>
         <w:t>London Plan Policy HC1</w:t>
       </w:r>
       <w:r>
-        <w:t xml:space="preserve"> days that development proposals should avoid harm and identify enhancement opportunities by integrating heritage considerations early on in the design process.</w:t>
-      </w:r>
-    </w:p>
-    <w:p>
-      <w:pPr>
-        <w:tabs>
-          <w:tab w:val="left" w:pos="5245"/>
-        </w:tabs>
-        <w:spacing w:after="0" w:line="240" w:lineRule="auto"/>
-      </w:pPr>
-    </w:p>
-    <w:p>
-      <w:pPr>
-        <w:tabs>
-          <w:tab w:val="left" w:pos="5245"/>
-        </w:tabs>
-        <w:spacing w:after="0" w:line="240" w:lineRule="auto"/>
-      </w:pPr>
-      <w:r>
-        <w:lastRenderedPageBreak/>
+        <w:t xml:space="preserve"> days that development proposals should avoid harm and identify enhancement opportunities by integrating heritage considerations </w:t>
+      </w:r>
+      <w:proofErr w:type="gramStart"/>
+      <w:r>
+        <w:t>early on in the</w:t>
+      </w:r>
+      <w:proofErr w:type="gramEnd"/>
+      <w:r>
+        <w:t xml:space="preserve"> design process.</w:t>
+      </w:r>
+    </w:p>
+    <w:p>
+      <w:pPr>
+        <w:tabs>
+          <w:tab w:val="left" w:pos="5245"/>
+        </w:tabs>
+        <w:spacing w:after="0" w:line="240" w:lineRule="auto"/>
+      </w:pPr>
+    </w:p>
+    <w:p>
+      <w:pPr>
+        <w:tabs>
+          <w:tab w:val="left" w:pos="5245"/>
+        </w:tabs>
+        <w:spacing w:after="0" w:line="240" w:lineRule="auto"/>
+      </w:pPr>
+      <w:r>
         <w:t xml:space="preserve">Policy HE10 of the NPPF says that </w:t>
       </w:r>
       <w:r>
-        <w:t>heritage assets with archaeological interest should be preserved in situ where feasible. Where an asset cannot be preserved or managed on-site, appropriate provision should be made for the investigation, understanding, recording, dissemination and archiving of that asset, which should be undertaken by suitably-qualified individuals or organisations</w:t>
+        <w:t xml:space="preserve">heritage assets with archaeological interest should be preserved in situ where feasible. Where an asset cannot be preserved or managed on-site, appropriate provision should be made for the investigation, understanding, recording, dissemination and archiving of that asset, which should be undertaken by </w:t>
+      </w:r>
+      <w:proofErr w:type="gramStart"/>
+      <w:r>
+        <w:t>suitably-qualified</w:t>
+      </w:r>
+      <w:proofErr w:type="gramEnd"/>
+      <w:r>
+        <w:t xml:space="preserve"> individuals or organisations</w:t>
       </w:r>
       <w:r>
         <w:t xml:space="preserve">.  </w:t>
@@ -1346,7 +1462,27 @@
         <w:sz w:val="16"/>
         <w:szCs w:val="16"/>
       </w:rPr>
-      <w:t>Historic England, 4th Floor, Cannon Bridge House, 25 Dowgate Hill, London EC4R 2YA</w:t>
+      <w:t xml:space="preserve">Historic England, 4th Floor, Cannon Bridge House, 25 </w:t>
+    </w:r>
+    <w:proofErr w:type="spellStart"/>
+    <w:r>
+      <w:rPr>
+        <w:b/>
+        <w:bCs/>
+        <w:sz w:val="16"/>
+        <w:szCs w:val="16"/>
+      </w:rPr>
+      <w:t>Dowgate</w:t>
+    </w:r>
+    <w:proofErr w:type="spellEnd"/>
+    <w:r>
+      <w:rPr>
+        <w:b/>
+        <w:bCs/>
+        <w:sz w:val="16"/>
+        <w:szCs w:val="16"/>
+      </w:rPr>
+      <w:t xml:space="preserve"> Hill, London EC4R 2YA</w:t>
     </w:r>
     <w:r>
       <w:rPr>
@@ -1362,7 +1498,23 @@
         <w:sz w:val="16"/>
         <w:szCs w:val="16"/>
       </w:rPr>
-      <w:t>Telephone 020 7973 3700  |  historicengland.org.uk</w:t>
+      <w:t xml:space="preserve">Telephone 020 7973 </w:t>
+    </w:r>
+    <w:proofErr w:type="gramStart"/>
+    <w:r>
+      <w:rPr>
+        <w:sz w:val="16"/>
+        <w:szCs w:val="16"/>
+      </w:rPr>
+      <w:t>3700  |</w:t>
+    </w:r>
+    <w:proofErr w:type="gramEnd"/>
+    <w:r>
+      <w:rPr>
+        <w:sz w:val="16"/>
+        <w:szCs w:val="16"/>
+      </w:rPr>
+      <w:t xml:space="preserve">  historicengland.org.uk</w:t>
     </w:r>
   </w:p>
   <w:p>
@@ -1991,6 +2143,7 @@
   <w:style w:type="paragraph" w:default="1" w:styleId="Normal">
     <w:name w:val="Normal"/>
     <w:qFormat/>
+    <w:rsid w:val="00667630"/>
     <w:pPr>
       <w:suppressAutoHyphens/>
     </w:pPr>
@@ -2838,25 +2991,6 @@
 </file>
 
 <file path=customXml/item1.xml><?xml version="1.0" encoding="utf-8"?>
-<?mso-contentType ?>
-<FormTemplates xmlns="http://schemas.microsoft.com/sharepoint/v3/contenttype/forms">
-  <Display>DocumentLibraryForm</Display>
-  <Edit>DocumentLibraryForm</Edit>
-  <New>DocumentLibraryForm</New>
-</FormTemplates>
-</file>
-
-<file path=customXml/item2.xml><?xml version="1.0" encoding="utf-8"?>
-<p:properties xmlns:p="http://schemas.microsoft.com/office/2006/metadata/properties" xmlns:xsi="http://www.w3.org/2001/XMLSchema-instance" xmlns:pc="http://schemas.microsoft.com/office/infopath/2007/PartnerControls">
-  <documentManagement>
-    <lcf76f155ced4ddcb4097134ff3c332f xmlns="15cbe5fe-a4ea-4c05-b898-23c40f76a47d">
-      <Terms xmlns="http://schemas.microsoft.com/office/infopath/2007/PartnerControls"/>
-    </lcf76f155ced4ddcb4097134ff3c332f>
-  </documentManagement>
-</p:properties>
-</file>
-
-<file path=customXml/item3.xml><?xml version="1.0" encoding="utf-8"?>
 <ct:contentTypeSchema xmlns:ct="http://schemas.microsoft.com/office/2006/metadata/contentType" xmlns:ma="http://schemas.microsoft.com/office/2006/metadata/properties/metaAttributes" ct:_="" ma:_="" ma:contentTypeName="Document" ma:contentTypeID="0x010100C5565420FCD8C44E84101235CBEBD69B" ma:contentTypeVersion="8" ma:contentTypeDescription="Create a new document." ma:contentTypeScope="" ma:versionID="5ae0978ac079970eb89ee730d4f7bb62">
   <xsd:schema xmlns:xsd="http://www.w3.org/2001/XMLSchema" xmlns:xs="http://www.w3.org/2001/XMLSchema" xmlns:p="http://schemas.microsoft.com/office/2006/metadata/properties" xmlns:ns2="15cbe5fe-a4ea-4c05-b898-23c40f76a47d" targetNamespace="http://schemas.microsoft.com/office/2006/metadata/properties" ma:root="true" ma:fieldsID="58940ddf787972d6e3bd4503c168aeb5" ns2:_="">
     <xsd:import namespace="15cbe5fe-a4ea-4c05-b898-23c40f76a47d"/>
@@ -3020,25 +3154,26 @@
 </ct:contentTypeSchema>
 </file>
 
-<file path=customXml/itemProps1.xml><?xml version="1.0" encoding="utf-8"?>
-<ds:datastoreItem xmlns:ds="http://schemas.openxmlformats.org/officeDocument/2006/customXml" ds:itemID="{82CA82EA-5203-4622-B659-A52A37C0B2F5}">
-  <ds:schemaRefs>
-    <ds:schemaRef ds:uri="http://schemas.microsoft.com/sharepoint/v3/contenttype/forms"/>
-  </ds:schemaRefs>
-</ds:datastoreItem>
+<file path=customXml/item2.xml><?xml version="1.0" encoding="utf-8"?>
+<?mso-contentType ?>
+<FormTemplates xmlns="http://schemas.microsoft.com/sharepoint/v3/contenttype/forms">
+  <Display>DocumentLibraryForm</Display>
+  <Edit>DocumentLibraryForm</Edit>
+  <New>DocumentLibraryForm</New>
+</FormTemplates>
 </file>
 
-<file path=customXml/itemProps2.xml><?xml version="1.0" encoding="utf-8"?>
-<ds:datastoreItem xmlns:ds="http://schemas.openxmlformats.org/officeDocument/2006/customXml" ds:itemID="{4E456FB0-4CA7-4355-8882-969D12BF7A1D}">
-  <ds:schemaRefs>
-    <ds:schemaRef ds:uri="http://schemas.microsoft.com/office/2006/metadata/properties"/>
-    <ds:schemaRef ds:uri="http://schemas.microsoft.com/office/infopath/2007/PartnerControls"/>
-    <ds:schemaRef ds:uri="15cbe5fe-a4ea-4c05-b898-23c40f76a47d"/>
-  </ds:schemaRefs>
-</ds:datastoreItem>
+<file path=customXml/item3.xml><?xml version="1.0" encoding="utf-8"?>
+<p:properties xmlns:p="http://schemas.microsoft.com/office/2006/metadata/properties" xmlns:xsi="http://www.w3.org/2001/XMLSchema-instance" xmlns:pc="http://schemas.microsoft.com/office/infopath/2007/PartnerControls">
+  <documentManagement>
+    <lcf76f155ced4ddcb4097134ff3c332f xmlns="15cbe5fe-a4ea-4c05-b898-23c40f76a47d">
+      <Terms xmlns="http://schemas.microsoft.com/office/infopath/2007/PartnerControls"/>
+    </lcf76f155ced4ddcb4097134ff3c332f>
+  </documentManagement>
+</p:properties>
 </file>
 
-<file path=customXml/itemProps3.xml><?xml version="1.0" encoding="utf-8"?>
+<file path=customXml/itemProps1.xml><?xml version="1.0" encoding="utf-8"?>
 <ds:datastoreItem xmlns:ds="http://schemas.openxmlformats.org/officeDocument/2006/customXml" ds:itemID="{B1A8F8A6-06CE-459D-B2DE-F6CEA2EE9D0E}">
   <ds:schemaRefs>
     <ds:schemaRef ds:uri="http://schemas.microsoft.com/office/2006/metadata/contentType"/>
@@ -3054,4 +3189,22 @@
     <ds:schemaRef ds:uri="http://schemas.microsoft.com/internal/obd"/>
   </ds:schemaRefs>
 </ds:datastoreItem>
+</file>
+
+<file path=customXml/itemProps2.xml><?xml version="1.0" encoding="utf-8"?>
+<ds:datastoreItem xmlns:ds="http://schemas.openxmlformats.org/officeDocument/2006/customXml" ds:itemID="{82CA82EA-5203-4622-B659-A52A37C0B2F5}">
+  <ds:schemaRefs>
+    <ds:schemaRef ds:uri="http://schemas.microsoft.com/sharepoint/v3/contenttype/forms"/>
+  </ds:schemaRefs>
+</ds:datastoreItem>
+</file>
+
+<file path=customXml/itemProps3.xml><?xml version="1.0" encoding="utf-8"?>
+<ds:datastoreItem xmlns:ds="http://schemas.openxmlformats.org/officeDocument/2006/customXml" ds:itemID="{4E456FB0-4CA7-4355-8882-969D12BF7A1D}">
+  <ds:schemaRefs>
+    <ds:schemaRef ds:uri="http://schemas.microsoft.com/office/2006/metadata/properties"/>
+    <ds:schemaRef ds:uri="http://schemas.microsoft.com/office/infopath/2007/PartnerControls"/>
+    <ds:schemaRef ds:uri="15cbe5fe-a4ea-4c05-b898-23c40f76a47d"/>
+  </ds:schemaRefs>
+</ds:datastoreItem>
 </file>
</xml_diff>

<commit_message>
Make code more generic
</commit_message>
<xml_diff>
--- a/arches_her/docx/Opt out Implications Letter.docx
+++ b/arches_her/docx/Opt out Implications Letter.docx
@@ -846,14 +846,6 @@
           <w:tab w:val="left" w:pos="5245"/>
         </w:tabs>
         <w:spacing w:after="0" w:line="240" w:lineRule="auto"/>
-      </w:pPr>
-    </w:p>
-    <w:p>
-      <w:pPr>
-        <w:tabs>
-          <w:tab w:val="left" w:pos="5245"/>
-        </w:tabs>
-        <w:spacing w:after="0" w:line="240" w:lineRule="auto"/>
         <w:rPr>
           <w:b/>
           <w:bCs/>
@@ -1014,21 +1006,7 @@
         <w:rPr>
           <w:rFonts w:eastAsia="Arial"/>
         </w:rPr>
-        <w:t xml:space="preserve"> that heritage assets should be conserved in a manner appropriate to their significance, and that development proposals should </w:t>
-      </w:r>
-      <w:proofErr w:type="gramStart"/>
-      <w:r>
-        <w:rPr>
-          <w:rFonts w:eastAsia="Arial"/>
-        </w:rPr>
-        <w:t>take into account</w:t>
-      </w:r>
-      <w:proofErr w:type="gramEnd"/>
-      <w:r>
-        <w:rPr>
-          <w:rFonts w:eastAsia="Arial"/>
-        </w:rPr>
-        <w:t xml:space="preserve"> the positive contributions heritage assets can make to sustainable communities and to places.  </w:t>
+        <w:t xml:space="preserve"> that heritage assets should be conserved in a manner appropriate to their significance, and that development proposals should take into account the positive contributions heritage assets can make to sustainable communities and to places.  </w:t>
       </w:r>
       <w:r>
         <w:t xml:space="preserve"> </w:t>
@@ -1050,19 +1028,10 @@
         <w:spacing w:after="0" w:line="240" w:lineRule="auto"/>
       </w:pPr>
       <w:r>
-        <w:lastRenderedPageBreak/>
         <w:t>London Plan Policy HC1</w:t>
       </w:r>
       <w:r>
-        <w:t xml:space="preserve"> days that development proposals should avoid harm and identify enhancement opportunities by integrating heritage considerations </w:t>
-      </w:r>
-      <w:proofErr w:type="gramStart"/>
-      <w:r>
-        <w:t>early on in the</w:t>
-      </w:r>
-      <w:proofErr w:type="gramEnd"/>
-      <w:r>
-        <w:t xml:space="preserve"> design process.</w:t>
+        <w:t xml:space="preserve"> days that development proposals should avoid harm and identify enhancement opportunities by integrating heritage considerations early on in the design process.</w:t>
       </w:r>
     </w:p>
     <w:p>
@@ -1084,15 +1053,7 @@
         <w:t xml:space="preserve">Policy HE10 of the NPPF says that </w:t>
       </w:r>
       <w:r>
-        <w:t xml:space="preserve">heritage assets with archaeological interest should be preserved in situ where feasible. Where an asset cannot be preserved or managed on-site, appropriate provision should be made for the investigation, understanding, recording, dissemination and archiving of that asset, which should be undertaken by </w:t>
-      </w:r>
-      <w:proofErr w:type="gramStart"/>
-      <w:r>
-        <w:t>suitably-qualified</w:t>
-      </w:r>
-      <w:proofErr w:type="gramEnd"/>
-      <w:r>
-        <w:t xml:space="preserve"> individuals or organisations</w:t>
+        <w:t>heritage assets with archaeological interest should be preserved in situ where feasible. Where an asset cannot be preserved or managed on-site, appropriate provision should be made for the investigation, understanding, recording, dissemination and archiving of that asset, which should be undertaken by suitably-qualified individuals or organisations</w:t>
       </w:r>
       <w:r>
         <w:t xml:space="preserve">.  </w:t>
@@ -1374,7 +1335,7 @@
             </wp:anchor>
           </w:drawing>
         </mc:Choice>
-        <mc:Fallback xmlns:arto="http://schemas.microsoft.com/office/word/2006/arto" xmlns:a="http://schemas.openxmlformats.org/drawingml/2006/main">
+        <mc:Fallback xmlns:a="http://schemas.openxmlformats.org/drawingml/2006/main" xmlns:arto="http://schemas.microsoft.com/office/word/2006/arto">
           <w:pict>
             <v:shapetype id="_x0000_t32" coordsize="21600,21600" o:oned="t" filled="f" o:spt="32" path="m,l21600,21600e" w14:anchorId="2CBF1BFB">
               <v:path fillok="f" arrowok="t" o:connecttype="none"/>
@@ -1439,7 +1400,7 @@
             </wp:anchor>
           </w:drawing>
         </mc:Choice>
-        <mc:Fallback xmlns:arto="http://schemas.microsoft.com/office/word/2006/arto" xmlns:a="http://schemas.openxmlformats.org/drawingml/2006/main">
+        <mc:Fallback xmlns:a="http://schemas.openxmlformats.org/drawingml/2006/main" xmlns:arto="http://schemas.microsoft.com/office/word/2006/arto">
           <w:pict>
             <v:shape id="Straight Connector 2" style="position:absolute;margin-left:1.6pt;margin-top:.5pt;width:0;height:0;z-index:251661312;visibility:visible;mso-wrap-style:square;mso-wrap-distance-left:9pt;mso-wrap-distance-top:0;mso-wrap-distance-right:9pt;mso-wrap-distance-bottom:0;mso-position-horizontal:absolute;mso-position-horizontal-relative:margin;mso-position-vertical:absolute;mso-position-vertical-relative:text" o:spid="_x0000_s1026" strokeweight=".08811mm" type="#_x0000_t32" o:gfxdata="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" w14:anchorId="613E3343">
               <v:stroke joinstyle="miter"/>
@@ -1462,27 +1423,7 @@
         <w:sz w:val="16"/>
         <w:szCs w:val="16"/>
       </w:rPr>
-      <w:t xml:space="preserve">Historic England, 4th Floor, Cannon Bridge House, 25 </w:t>
-    </w:r>
-    <w:proofErr w:type="spellStart"/>
-    <w:r>
-      <w:rPr>
-        <w:b/>
-        <w:bCs/>
-        <w:sz w:val="16"/>
-        <w:szCs w:val="16"/>
-      </w:rPr>
-      <w:t>Dowgate</w:t>
-    </w:r>
-    <w:proofErr w:type="spellEnd"/>
-    <w:r>
-      <w:rPr>
-        <w:b/>
-        <w:bCs/>
-        <w:sz w:val="16"/>
-        <w:szCs w:val="16"/>
-      </w:rPr>
-      <w:t xml:space="preserve"> Hill, London EC4R 2YA</w:t>
+      <w:t>Historic England, 4th Floor, Cannon Bridge House, 25 Dowgate Hill, London EC4R 2YA</w:t>
     </w:r>
     <w:r>
       <w:rPr>
@@ -1498,23 +1439,7 @@
         <w:sz w:val="16"/>
         <w:szCs w:val="16"/>
       </w:rPr>
-      <w:t xml:space="preserve">Telephone 020 7973 </w:t>
-    </w:r>
-    <w:proofErr w:type="gramStart"/>
-    <w:r>
-      <w:rPr>
-        <w:sz w:val="16"/>
-        <w:szCs w:val="16"/>
-      </w:rPr>
-      <w:t>3700  |</w:t>
-    </w:r>
-    <w:proofErr w:type="gramEnd"/>
-    <w:r>
-      <w:rPr>
-        <w:sz w:val="16"/>
-        <w:szCs w:val="16"/>
-      </w:rPr>
-      <w:t xml:space="preserve">  historicengland.org.uk</w:t>
+      <w:t>Telephone 020 7973 3700  |  historicengland.org.uk</w:t>
     </w:r>
   </w:p>
   <w:p>
@@ -2991,6 +2916,15 @@
 </file>
 
 <file path=customXml/item1.xml><?xml version="1.0" encoding="utf-8"?>
+<?mso-contentType ?>
+<FormTemplates xmlns="http://schemas.microsoft.com/sharepoint/v3/contenttype/forms">
+  <Display>DocumentLibraryForm</Display>
+  <Edit>DocumentLibraryForm</Edit>
+  <New>DocumentLibraryForm</New>
+</FormTemplates>
+</file>
+
+<file path=customXml/item2.xml><?xml version="1.0" encoding="utf-8"?>
 <ct:contentTypeSchema xmlns:ct="http://schemas.microsoft.com/office/2006/metadata/contentType" xmlns:ma="http://schemas.microsoft.com/office/2006/metadata/properties/metaAttributes" ct:_="" ma:_="" ma:contentTypeName="Document" ma:contentTypeID="0x010100C5565420FCD8C44E84101235CBEBD69B" ma:contentTypeVersion="8" ma:contentTypeDescription="Create a new document." ma:contentTypeScope="" ma:versionID="5ae0978ac079970eb89ee730d4f7bb62">
   <xsd:schema xmlns:xsd="http://www.w3.org/2001/XMLSchema" xmlns:xs="http://www.w3.org/2001/XMLSchema" xmlns:p="http://schemas.microsoft.com/office/2006/metadata/properties" xmlns:ns2="15cbe5fe-a4ea-4c05-b898-23c40f76a47d" targetNamespace="http://schemas.microsoft.com/office/2006/metadata/properties" ma:root="true" ma:fieldsID="58940ddf787972d6e3bd4503c168aeb5" ns2:_="">
     <xsd:import namespace="15cbe5fe-a4ea-4c05-b898-23c40f76a47d"/>
@@ -3154,15 +3088,6 @@
 </ct:contentTypeSchema>
 </file>
 
-<file path=customXml/item2.xml><?xml version="1.0" encoding="utf-8"?>
-<?mso-contentType ?>
-<FormTemplates xmlns="http://schemas.microsoft.com/sharepoint/v3/contenttype/forms">
-  <Display>DocumentLibraryForm</Display>
-  <Edit>DocumentLibraryForm</Edit>
-  <New>DocumentLibraryForm</New>
-</FormTemplates>
-</file>
-
 <file path=customXml/item3.xml><?xml version="1.0" encoding="utf-8"?>
 <p:properties xmlns:p="http://schemas.microsoft.com/office/2006/metadata/properties" xmlns:xsi="http://www.w3.org/2001/XMLSchema-instance" xmlns:pc="http://schemas.microsoft.com/office/infopath/2007/PartnerControls">
   <documentManagement>
@@ -3174,6 +3099,14 @@
 </file>
 
 <file path=customXml/itemProps1.xml><?xml version="1.0" encoding="utf-8"?>
+<ds:datastoreItem xmlns:ds="http://schemas.openxmlformats.org/officeDocument/2006/customXml" ds:itemID="{82CA82EA-5203-4622-B659-A52A37C0B2F5}">
+  <ds:schemaRefs>
+    <ds:schemaRef ds:uri="http://schemas.microsoft.com/sharepoint/v3/contenttype/forms"/>
+  </ds:schemaRefs>
+</ds:datastoreItem>
+</file>
+
+<file path=customXml/itemProps2.xml><?xml version="1.0" encoding="utf-8"?>
 <ds:datastoreItem xmlns:ds="http://schemas.openxmlformats.org/officeDocument/2006/customXml" ds:itemID="{B1A8F8A6-06CE-459D-B2DE-F6CEA2EE9D0E}">
   <ds:schemaRefs>
     <ds:schemaRef ds:uri="http://schemas.microsoft.com/office/2006/metadata/contentType"/>
@@ -3191,14 +3124,6 @@
 </ds:datastoreItem>
 </file>
 
-<file path=customXml/itemProps2.xml><?xml version="1.0" encoding="utf-8"?>
-<ds:datastoreItem xmlns:ds="http://schemas.openxmlformats.org/officeDocument/2006/customXml" ds:itemID="{82CA82EA-5203-4622-B659-A52A37C0B2F5}">
-  <ds:schemaRefs>
-    <ds:schemaRef ds:uri="http://schemas.microsoft.com/sharepoint/v3/contenttype/forms"/>
-  </ds:schemaRefs>
-</ds:datastoreItem>
-</file>
-
 <file path=customXml/itemProps3.xml><?xml version="1.0" encoding="utf-8"?>
 <ds:datastoreItem xmlns:ds="http://schemas.openxmlformats.org/officeDocument/2006/customXml" ds:itemID="{4E456FB0-4CA7-4355-8882-969D12BF7A1D}">
   <ds:schemaRefs>

</xml_diff>

<commit_message>
Reduce line break from 4 to 1
</commit_message>
<xml_diff>
--- a/arches_her/docx/Opt out Implications Letter.docx
+++ b/arches_her/docx/Opt out Implications Letter.docx
@@ -646,30 +646,6 @@
           <w:tab w:val="left" w:pos="5245"/>
         </w:tabs>
         <w:spacing w:after="0" w:line="240" w:lineRule="auto"/>
-      </w:pPr>
-    </w:p>
-    <w:p>
-      <w:pPr>
-        <w:tabs>
-          <w:tab w:val="left" w:pos="5245"/>
-        </w:tabs>
-        <w:spacing w:after="0" w:line="240" w:lineRule="auto"/>
-      </w:pPr>
-    </w:p>
-    <w:p>
-      <w:pPr>
-        <w:tabs>
-          <w:tab w:val="left" w:pos="5245"/>
-        </w:tabs>
-        <w:spacing w:after="0" w:line="240" w:lineRule="auto"/>
-      </w:pPr>
-    </w:p>
-    <w:p>
-      <w:pPr>
-        <w:tabs>
-          <w:tab w:val="left" w:pos="5245"/>
-        </w:tabs>
-        <w:spacing w:after="0" w:line="240" w:lineRule="auto"/>
         <w:rPr>
           <w:b/>
           <w:bCs/>
@@ -1053,7 +1029,11 @@
         <w:t xml:space="preserve">Policy HE10 of the NPPF says that </w:t>
       </w:r>
       <w:r>
-        <w:t>heritage assets with archaeological interest should be preserved in situ where feasible. Where an asset cannot be preserved or managed on-site, appropriate provision should be made for the investigation, understanding, recording, dissemination and archiving of that asset, which should be undertaken by suitably-qualified individuals or organisations</w:t>
+        <w:t xml:space="preserve">heritage assets with archaeological interest should be preserved in situ where feasible. Where an asset cannot be preserved or managed on-site, </w:t>
+      </w:r>
+      <w:r>
+        <w:lastRenderedPageBreak/>
+        <w:t>appropriate provision should be made for the investigation, understanding, recording, dissemination and archiving of that asset, which should be undertaken by suitably-qualified individuals or organisations</w:t>
       </w:r>
       <w:r>
         <w:t xml:space="preserve">.  </w:t>
@@ -1335,7 +1315,7 @@
             </wp:anchor>
           </w:drawing>
         </mc:Choice>
-        <mc:Fallback xmlns:a="http://schemas.openxmlformats.org/drawingml/2006/main" xmlns:arto="http://schemas.microsoft.com/office/word/2006/arto">
+        <mc:Fallback xmlns:arto="http://schemas.microsoft.com/office/word/2006/arto" xmlns:a="http://schemas.openxmlformats.org/drawingml/2006/main">
           <w:pict>
             <v:shapetype id="_x0000_t32" coordsize="21600,21600" o:oned="t" filled="f" o:spt="32" path="m,l21600,21600e" w14:anchorId="2CBF1BFB">
               <v:path fillok="f" arrowok="t" o:connecttype="none"/>
@@ -1400,7 +1380,7 @@
             </wp:anchor>
           </w:drawing>
         </mc:Choice>
-        <mc:Fallback xmlns:a="http://schemas.openxmlformats.org/drawingml/2006/main" xmlns:arto="http://schemas.microsoft.com/office/word/2006/arto">
+        <mc:Fallback xmlns:arto="http://schemas.microsoft.com/office/word/2006/arto" xmlns:a="http://schemas.openxmlformats.org/drawingml/2006/main">
           <w:pict>
             <v:shape id="Straight Connector 2" style="position:absolute;margin-left:1.6pt;margin-top:.5pt;width:0;height:0;z-index:251661312;visibility:visible;mso-wrap-style:square;mso-wrap-distance-left:9pt;mso-wrap-distance-top:0;mso-wrap-distance-right:9pt;mso-wrap-distance-bottom:0;mso-position-horizontal:absolute;mso-position-horizontal-relative:margin;mso-position-vertical:absolute;mso-position-vertical-relative:text" o:spid="_x0000_s1026" strokeweight=".08811mm" type="#_x0000_t32" o:gfxdata="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" w14:anchorId="613E3343">
               <v:stroke joinstyle="miter"/>
@@ -1423,7 +1403,27 @@
         <w:sz w:val="16"/>
         <w:szCs w:val="16"/>
       </w:rPr>
-      <w:t>Historic England, 4th Floor, Cannon Bridge House, 25 Dowgate Hill, London EC4R 2YA</w:t>
+      <w:t xml:space="preserve">Historic England, 4th Floor, Cannon Bridge House, 25 </w:t>
+    </w:r>
+    <w:proofErr w:type="spellStart"/>
+    <w:r>
+      <w:rPr>
+        <w:b/>
+        <w:bCs/>
+        <w:sz w:val="16"/>
+        <w:szCs w:val="16"/>
+      </w:rPr>
+      <w:t>Dowgate</w:t>
+    </w:r>
+    <w:proofErr w:type="spellEnd"/>
+    <w:r>
+      <w:rPr>
+        <w:b/>
+        <w:bCs/>
+        <w:sz w:val="16"/>
+        <w:szCs w:val="16"/>
+      </w:rPr>
+      <w:t xml:space="preserve"> Hill, London EC4R 2YA</w:t>
     </w:r>
     <w:r>
       <w:rPr>
@@ -2916,12 +2916,13 @@
 </file>
 
 <file path=customXml/item1.xml><?xml version="1.0" encoding="utf-8"?>
-<?mso-contentType ?>
-<FormTemplates xmlns="http://schemas.microsoft.com/sharepoint/v3/contenttype/forms">
-  <Display>DocumentLibraryForm</Display>
-  <Edit>DocumentLibraryForm</Edit>
-  <New>DocumentLibraryForm</New>
-</FormTemplates>
+<p:properties xmlns:p="http://schemas.microsoft.com/office/2006/metadata/properties" xmlns:xsi="http://www.w3.org/2001/XMLSchema-instance" xmlns:pc="http://schemas.microsoft.com/office/infopath/2007/PartnerControls">
+  <documentManagement>
+    <lcf76f155ced4ddcb4097134ff3c332f xmlns="15cbe5fe-a4ea-4c05-b898-23c40f76a47d">
+      <Terms xmlns="http://schemas.microsoft.com/office/infopath/2007/PartnerControls"/>
+    </lcf76f155ced4ddcb4097134ff3c332f>
+  </documentManagement>
+</p:properties>
 </file>
 
 <file path=customXml/item2.xml><?xml version="1.0" encoding="utf-8"?>
@@ -3089,19 +3090,20 @@
 </file>
 
 <file path=customXml/item3.xml><?xml version="1.0" encoding="utf-8"?>
-<p:properties xmlns:p="http://schemas.microsoft.com/office/2006/metadata/properties" xmlns:xsi="http://www.w3.org/2001/XMLSchema-instance" xmlns:pc="http://schemas.microsoft.com/office/infopath/2007/PartnerControls">
-  <documentManagement>
-    <lcf76f155ced4ddcb4097134ff3c332f xmlns="15cbe5fe-a4ea-4c05-b898-23c40f76a47d">
-      <Terms xmlns="http://schemas.microsoft.com/office/infopath/2007/PartnerControls"/>
-    </lcf76f155ced4ddcb4097134ff3c332f>
-  </documentManagement>
-</p:properties>
+<?mso-contentType ?>
+<FormTemplates xmlns="http://schemas.microsoft.com/sharepoint/v3/contenttype/forms">
+  <Display>DocumentLibraryForm</Display>
+  <Edit>DocumentLibraryForm</Edit>
+  <New>DocumentLibraryForm</New>
+</FormTemplates>
 </file>
 
 <file path=customXml/itemProps1.xml><?xml version="1.0" encoding="utf-8"?>
-<ds:datastoreItem xmlns:ds="http://schemas.openxmlformats.org/officeDocument/2006/customXml" ds:itemID="{82CA82EA-5203-4622-B659-A52A37C0B2F5}">
+<ds:datastoreItem xmlns:ds="http://schemas.openxmlformats.org/officeDocument/2006/customXml" ds:itemID="{4E456FB0-4CA7-4355-8882-969D12BF7A1D}">
   <ds:schemaRefs>
-    <ds:schemaRef ds:uri="http://schemas.microsoft.com/sharepoint/v3/contenttype/forms"/>
+    <ds:schemaRef ds:uri="http://schemas.microsoft.com/office/2006/metadata/properties"/>
+    <ds:schemaRef ds:uri="http://schemas.microsoft.com/office/infopath/2007/PartnerControls"/>
+    <ds:schemaRef ds:uri="15cbe5fe-a4ea-4c05-b898-23c40f76a47d"/>
   </ds:schemaRefs>
 </ds:datastoreItem>
 </file>
@@ -3125,11 +3127,9 @@
 </file>
 
 <file path=customXml/itemProps3.xml><?xml version="1.0" encoding="utf-8"?>
-<ds:datastoreItem xmlns:ds="http://schemas.openxmlformats.org/officeDocument/2006/customXml" ds:itemID="{4E456FB0-4CA7-4355-8882-969D12BF7A1D}">
+<ds:datastoreItem xmlns:ds="http://schemas.openxmlformats.org/officeDocument/2006/customXml" ds:itemID="{82CA82EA-5203-4622-B659-A52A37C0B2F5}">
   <ds:schemaRefs>
-    <ds:schemaRef ds:uri="http://schemas.microsoft.com/office/2006/metadata/properties"/>
-    <ds:schemaRef ds:uri="http://schemas.microsoft.com/office/infopath/2007/PartnerControls"/>
-    <ds:schemaRef ds:uri="15cbe5fe-a4ea-4c05-b898-23c40f76a47d"/>
+    <ds:schemaRef ds:uri="http://schemas.microsoft.com/sharepoint/v3/contenttype/forms"/>
   </ds:schemaRefs>
 </ds:datastoreItem>
 </file>
</xml_diff>

<commit_message>
Remove hyphen and include <> as not equal
</commit_message>
<xml_diff>
--- a/arches_her/docx/Opt out Implications Letter.docx
+++ b/arches_her/docx/Opt out Implications Letter.docx
@@ -698,102 +698,68 @@
         <w:rPr>
           <w:rFonts w:cstheme="minorHAnsi"/>
         </w:rPr>
+        <w:lastRenderedPageBreak/>
         <w:t>&lt;IF Archaeological Priority Area is not empty&gt;</w:t>
       </w:r>
-      <w:r>
+    </w:p>
+    <w:p>
+      <w:pPr>
+        <w:spacing w:after="0" w:line="240" w:lineRule="auto"/>
+      </w:pPr>
+      <w:r>
+        <w:t>This applicatio</w:t>
+      </w:r>
+      <w:r>
+        <w:t xml:space="preserve">n site </w:t>
+      </w:r>
+      <w:r>
+        <w:t>lies within &lt;Archaeological Priority Area&gt; and is of a nature and scale that its effect on heritage assets of archaeological interest should be assessed.</w:t>
+      </w:r>
+    </w:p>
+    <w:p>
+      <w:pPr>
+        <w:tabs>
+          <w:tab w:val="left" w:pos="5245"/>
+        </w:tabs>
+        <w:spacing w:after="0" w:line="240" w:lineRule="auto"/>
         <w:rPr>
           <w:rFonts w:cstheme="minorHAnsi"/>
         </w:rPr>
-      </w:r>
+      </w:pPr>
       <w:r>
         <w:rPr>
           <w:rFonts w:cstheme="minorHAnsi"/>
         </w:rPr>
-      </w:r>
-      <w:r>
+        <w:t>&lt;ELSE&gt;</w:t>
+      </w:r>
+    </w:p>
+    <w:p>
+      <w:pPr>
+        <w:tabs>
+          <w:tab w:val="left" w:pos="5245"/>
+        </w:tabs>
+        <w:spacing w:after="0" w:line="240" w:lineRule="auto"/>
+      </w:pPr>
+      <w:r>
+        <w:t>Even though this planning application is not located within an Archaeological Priority Area it is of a nature and of sufficient scale that its effect on heritage assets of archaeological interest should be assessed.</w:t>
+      </w:r>
+    </w:p>
+    <w:p>
+      <w:pPr>
+        <w:tabs>
+          <w:tab w:val="left" w:pos="5245"/>
+        </w:tabs>
+        <w:spacing w:after="0" w:line="240" w:lineRule="auto"/>
         <w:rPr>
           <w:rFonts w:cstheme="minorHAnsi"/>
         </w:rPr>
-      </w:r>
-    </w:p>
-    <w:p>
-      <w:pPr>
-        <w:spacing w:after="0" w:line="240" w:lineRule="auto"/>
-      </w:pPr>
-      <w:r>
-        <w:t>This applicatio</w:t>
-      </w:r>
-      <w:r>
-        <w:t xml:space="preserve">n site </w:t>
-      </w:r>
-      <w:r>
-        <w:t>lies within &lt;Archaeological Priority Area&gt; and is of a nature and scale that its effect on heritage assets of archaeological interest should be assessed.</w:t>
-      </w:r>
-    </w:p>
-    <w:p>
-      <w:pPr>
-        <w:tabs>
-          <w:tab w:val="left" w:pos="5245"/>
-        </w:tabs>
-        <w:spacing w:after="0" w:line="240" w:lineRule="auto"/>
+      </w:pPr>
+      <w:r>
         <w:rPr>
           <w:rFonts w:cstheme="minorHAnsi"/>
         </w:rPr>
-      </w:pPr>
-      <w:r>
-        <w:rPr>
-          <w:rFonts w:cstheme="minorHAnsi"/>
-        </w:rPr>
-        <w:t>&lt;ELSE&gt;</w:t>
-      </w:r>
-      <w:r>
-        <w:rPr>
-          <w:rFonts w:cstheme="minorHAnsi"/>
-        </w:rPr>
-      </w:r>
-      <w:r>
-        <w:rPr>
-          <w:rFonts w:cstheme="minorHAnsi"/>
-        </w:rPr>
-      </w:r>
-    </w:p>
-    <w:p>
-      <w:pPr>
-        <w:tabs>
-          <w:tab w:val="left" w:pos="5245"/>
-        </w:tabs>
-        <w:spacing w:after="0" w:line="240" w:lineRule="auto"/>
-      </w:pPr>
-      <w:r>
-        <w:t>Even though this planning application is not located within an Archaeological Priority Area it is of a nature and of sufficient scale that its effect on heritage assets of archaeological interest should be assessed.</w:t>
-      </w:r>
-    </w:p>
-    <w:p>
-      <w:pPr>
-        <w:tabs>
-          <w:tab w:val="left" w:pos="5245"/>
-        </w:tabs>
-        <w:spacing w:after="0" w:line="240" w:lineRule="auto"/>
-        <w:rPr>
-          <w:rFonts w:cstheme="minorHAnsi"/>
-        </w:rPr>
-      </w:pPr>
-      <w:r>
-        <w:rPr>
-          <w:rFonts w:cstheme="minorHAnsi"/>
-        </w:rPr>
         <w:t>&lt;END IF&gt;</w:t>
       </w:r>
-      <w:r>
-        <w:rPr>
-          <w:rFonts w:cstheme="minorHAnsi"/>
-        </w:rPr>
-      </w:r>
-      <w:r>
-        <w:rPr>
-          <w:rFonts w:cstheme="minorHAnsi"/>
-        </w:rPr>
-      </w:r>
     </w:p>
     <w:p>
       <w:pPr>
@@ -813,8 +779,6 @@
       <w:r>
         <w:t>&lt;Assessment of Significance&gt;</w:t>
       </w:r>
-      <w:r/>
-      <w:r/>
     </w:p>
     <w:p>
       <w:pPr>
@@ -1203,7 +1167,7 @@
           <w:bCs/>
           <w:color w:val="FF0000"/>
         </w:rPr>
-        <w:t>-</w:t>
+        <w:t xml:space="preserve"> </w:t>
       </w:r>
       <w:r>
         <w:rPr>
@@ -1315,7 +1279,7 @@
             </wp:anchor>
           </w:drawing>
         </mc:Choice>
-        <mc:Fallback xmlns:arto="http://schemas.microsoft.com/office/word/2006/arto" xmlns:a="http://schemas.openxmlformats.org/drawingml/2006/main">
+        <mc:Fallback xmlns:a="http://schemas.openxmlformats.org/drawingml/2006/main" xmlns:arto="http://schemas.microsoft.com/office/word/2006/arto">
           <w:pict>
             <v:shapetype id="_x0000_t32" coordsize="21600,21600" o:oned="t" filled="f" o:spt="32" path="m,l21600,21600e" w14:anchorId="2CBF1BFB">
               <v:path fillok="f" arrowok="t" o:connecttype="none"/>
@@ -1380,7 +1344,7 @@
             </wp:anchor>
           </w:drawing>
         </mc:Choice>
-        <mc:Fallback xmlns:arto="http://schemas.microsoft.com/office/word/2006/arto" xmlns:a="http://schemas.openxmlformats.org/drawingml/2006/main">
+        <mc:Fallback xmlns:a="http://schemas.openxmlformats.org/drawingml/2006/main" xmlns:arto="http://schemas.microsoft.com/office/word/2006/arto">
           <w:pict>
             <v:shape id="Straight Connector 2" style="position:absolute;margin-left:1.6pt;margin-top:.5pt;width:0;height:0;z-index:251661312;visibility:visible;mso-wrap-style:square;mso-wrap-distance-left:9pt;mso-wrap-distance-top:0;mso-wrap-distance-right:9pt;mso-wrap-distance-bottom:0;mso-position-horizontal:absolute;mso-position-horizontal-relative:margin;mso-position-vertical:absolute;mso-position-vertical-relative:text" o:spid="_x0000_s1026" strokeweight=".08811mm" type="#_x0000_t32" o:gfxdata="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" w14:anchorId="613E3343">
               <v:stroke joinstyle="miter"/>
@@ -1403,27 +1367,7 @@
         <w:sz w:val="16"/>
         <w:szCs w:val="16"/>
       </w:rPr>
-      <w:t xml:space="preserve">Historic England, 4th Floor, Cannon Bridge House, 25 </w:t>
-    </w:r>
-    <w:proofErr w:type="spellStart"/>
-    <w:r>
-      <w:rPr>
-        <w:b/>
-        <w:bCs/>
-        <w:sz w:val="16"/>
-        <w:szCs w:val="16"/>
-      </w:rPr>
-      <w:t>Dowgate</w:t>
-    </w:r>
-    <w:proofErr w:type="spellEnd"/>
-    <w:r>
-      <w:rPr>
-        <w:b/>
-        <w:bCs/>
-        <w:sz w:val="16"/>
-        <w:szCs w:val="16"/>
-      </w:rPr>
-      <w:t xml:space="preserve"> Hill, London EC4R 2YA</w:t>
+      <w:t>Historic England, 4th Floor, Cannon Bridge House, 25 Dowgate Hill, London EC4R 2YA</w:t>
     </w:r>
     <w:r>
       <w:rPr>
@@ -2916,16 +2860,6 @@
 </file>
 
 <file path=customXml/item1.xml><?xml version="1.0" encoding="utf-8"?>
-<p:properties xmlns:p="http://schemas.microsoft.com/office/2006/metadata/properties" xmlns:xsi="http://www.w3.org/2001/XMLSchema-instance" xmlns:pc="http://schemas.microsoft.com/office/infopath/2007/PartnerControls">
-  <documentManagement>
-    <lcf76f155ced4ddcb4097134ff3c332f xmlns="15cbe5fe-a4ea-4c05-b898-23c40f76a47d">
-      <Terms xmlns="http://schemas.microsoft.com/office/infopath/2007/PartnerControls"/>
-    </lcf76f155ced4ddcb4097134ff3c332f>
-  </documentManagement>
-</p:properties>
-</file>
-
-<file path=customXml/item2.xml><?xml version="1.0" encoding="utf-8"?>
 <ct:contentTypeSchema xmlns:ct="http://schemas.microsoft.com/office/2006/metadata/contentType" xmlns:ma="http://schemas.microsoft.com/office/2006/metadata/properties/metaAttributes" ct:_="" ma:_="" ma:contentTypeName="Document" ma:contentTypeID="0x010100C5565420FCD8C44E84101235CBEBD69B" ma:contentTypeVersion="8" ma:contentTypeDescription="Create a new document." ma:contentTypeScope="" ma:versionID="5ae0978ac079970eb89ee730d4f7bb62">
   <xsd:schema xmlns:xsd="http://www.w3.org/2001/XMLSchema" xmlns:xs="http://www.w3.org/2001/XMLSchema" xmlns:p="http://schemas.microsoft.com/office/2006/metadata/properties" xmlns:ns2="15cbe5fe-a4ea-4c05-b898-23c40f76a47d" targetNamespace="http://schemas.microsoft.com/office/2006/metadata/properties" ma:root="true" ma:fieldsID="58940ddf787972d6e3bd4503c168aeb5" ns2:_="">
     <xsd:import namespace="15cbe5fe-a4ea-4c05-b898-23c40f76a47d"/>
@@ -3089,6 +3023,16 @@
 </ct:contentTypeSchema>
 </file>
 
+<file path=customXml/item2.xml><?xml version="1.0" encoding="utf-8"?>
+<p:properties xmlns:p="http://schemas.microsoft.com/office/2006/metadata/properties" xmlns:xsi="http://www.w3.org/2001/XMLSchema-instance" xmlns:pc="http://schemas.microsoft.com/office/infopath/2007/PartnerControls">
+  <documentManagement>
+    <lcf76f155ced4ddcb4097134ff3c332f xmlns="15cbe5fe-a4ea-4c05-b898-23c40f76a47d">
+      <Terms xmlns="http://schemas.microsoft.com/office/infopath/2007/PartnerControls"/>
+    </lcf76f155ced4ddcb4097134ff3c332f>
+  </documentManagement>
+</p:properties>
+</file>
+
 <file path=customXml/item3.xml><?xml version="1.0" encoding="utf-8"?>
 <?mso-contentType ?>
 <FormTemplates xmlns="http://schemas.microsoft.com/sharepoint/v3/contenttype/forms">
@@ -3099,16 +3043,6 @@
 </file>
 
 <file path=customXml/itemProps1.xml><?xml version="1.0" encoding="utf-8"?>
-<ds:datastoreItem xmlns:ds="http://schemas.openxmlformats.org/officeDocument/2006/customXml" ds:itemID="{4E456FB0-4CA7-4355-8882-969D12BF7A1D}">
-  <ds:schemaRefs>
-    <ds:schemaRef ds:uri="http://schemas.microsoft.com/office/2006/metadata/properties"/>
-    <ds:schemaRef ds:uri="http://schemas.microsoft.com/office/infopath/2007/PartnerControls"/>
-    <ds:schemaRef ds:uri="15cbe5fe-a4ea-4c05-b898-23c40f76a47d"/>
-  </ds:schemaRefs>
-</ds:datastoreItem>
-</file>
-
-<file path=customXml/itemProps2.xml><?xml version="1.0" encoding="utf-8"?>
 <ds:datastoreItem xmlns:ds="http://schemas.openxmlformats.org/officeDocument/2006/customXml" ds:itemID="{B1A8F8A6-06CE-459D-B2DE-F6CEA2EE9D0E}">
   <ds:schemaRefs>
     <ds:schemaRef ds:uri="http://schemas.microsoft.com/office/2006/metadata/contentType"/>
@@ -3126,6 +3060,16 @@
 </ds:datastoreItem>
 </file>
 
+<file path=customXml/itemProps2.xml><?xml version="1.0" encoding="utf-8"?>
+<ds:datastoreItem xmlns:ds="http://schemas.openxmlformats.org/officeDocument/2006/customXml" ds:itemID="{4E456FB0-4CA7-4355-8882-969D12BF7A1D}">
+  <ds:schemaRefs>
+    <ds:schemaRef ds:uri="http://schemas.microsoft.com/office/2006/metadata/properties"/>
+    <ds:schemaRef ds:uri="http://schemas.microsoft.com/office/infopath/2007/PartnerControls"/>
+    <ds:schemaRef ds:uri="15cbe5fe-a4ea-4c05-b898-23c40f76a47d"/>
+  </ds:schemaRefs>
+</ds:datastoreItem>
+</file>
+
 <file path=customXml/itemProps3.xml><?xml version="1.0" encoding="utf-8"?>
 <ds:datastoreItem xmlns:ds="http://schemas.openxmlformats.org/officeDocument/2006/customXml" ds:itemID="{82CA82EA-5203-4622-B659-A52A37C0B2F5}">
   <ds:schemaRefs>

</xml_diff>

<commit_message>
Remove hyphen from suitably-qualified
</commit_message>
<xml_diff>
--- a/arches_her/docx/Opt out Implications Letter.docx
+++ b/arches_her/docx/Opt out Implications Letter.docx
@@ -946,7 +946,21 @@
         <w:rPr>
           <w:rFonts w:eastAsia="Arial"/>
         </w:rPr>
-        <w:t xml:space="preserve"> that heritage assets should be conserved in a manner appropriate to their significance, and that development proposals should take into account the positive contributions heritage assets can make to sustainable communities and to places.  </w:t>
+        <w:t xml:space="preserve"> that heritage assets should be conserved in a manner appropriate to their significance, and that development proposals should </w:t>
+      </w:r>
+      <w:proofErr w:type="gramStart"/>
+      <w:r>
+        <w:rPr>
+          <w:rFonts w:eastAsia="Arial"/>
+        </w:rPr>
+        <w:t>take into account</w:t>
+      </w:r>
+      <w:proofErr w:type="gramEnd"/>
+      <w:r>
+        <w:rPr>
+          <w:rFonts w:eastAsia="Arial"/>
+        </w:rPr>
+        <w:t xml:space="preserve"> the positive contributions heritage assets can make to sustainable communities and to places.  </w:t>
       </w:r>
       <w:r>
         <w:t xml:space="preserve"> </w:t>
@@ -971,7 +985,15 @@
         <w:t>London Plan Policy HC1</w:t>
       </w:r>
       <w:r>
-        <w:t xml:space="preserve"> days that development proposals should avoid harm and identify enhancement opportunities by integrating heritage considerations early on in the design process.</w:t>
+        <w:t xml:space="preserve"> days that development proposals should avoid harm and identify enhancement opportunities by integrating heritage considerations </w:t>
+      </w:r>
+      <w:proofErr w:type="gramStart"/>
+      <w:r>
+        <w:t>early on in the</w:t>
+      </w:r>
+      <w:proofErr w:type="gramEnd"/>
+      <w:r>
+        <w:t xml:space="preserve"> design process.</w:t>
       </w:r>
     </w:p>
     <w:p>
@@ -997,7 +1019,13 @@
       </w:r>
       <w:r>
         <w:lastRenderedPageBreak/>
-        <w:t>appropriate provision should be made for the investigation, understanding, recording, dissemination and archiving of that asset, which should be undertaken by suitably-qualified individuals or organisations</w:t>
+        <w:t>appropriate provision should be made for the investigation, understanding, recording, dissemination and archiving of that asset, which should be undertaken by suitably</w:t>
+      </w:r>
+      <w:r>
+        <w:t xml:space="preserve"> </w:t>
+      </w:r>
+      <w:r>
+        <w:t>qualified individuals or organisations</w:t>
       </w:r>
       <w:r>
         <w:t xml:space="preserve">.  </w:t>
@@ -1159,7 +1187,15 @@
           <w:b/>
           <w:bCs/>
         </w:rPr>
-        <w:t>London and South</w:t>
+        <w:t xml:space="preserve">London and </w:t>
+      </w:r>
+      <w:proofErr w:type="gramStart"/>
+      <w:r>
+        <w:rPr>
+          <w:b/>
+          <w:bCs/>
+        </w:rPr>
+        <w:t>South</w:t>
       </w:r>
       <w:r>
         <w:rPr>
@@ -1174,7 +1210,15 @@
           <w:b/>
           <w:bCs/>
         </w:rPr>
-        <w:t>East Region</w:t>
+        <w:t>East</w:t>
+      </w:r>
+      <w:proofErr w:type="gramEnd"/>
+      <w:r>
+        <w:rPr>
+          <w:b/>
+          <w:bCs/>
+        </w:rPr>
+        <w:t xml:space="preserve"> Region</w:t>
       </w:r>
     </w:p>
     <w:p/>
@@ -1279,7 +1323,7 @@
             </wp:anchor>
           </w:drawing>
         </mc:Choice>
-        <mc:Fallback xmlns:a="http://schemas.openxmlformats.org/drawingml/2006/main" xmlns:arto="http://schemas.microsoft.com/office/word/2006/arto">
+        <mc:Fallback xmlns:arto="http://schemas.microsoft.com/office/word/2006/arto" xmlns:a="http://schemas.openxmlformats.org/drawingml/2006/main">
           <w:pict>
             <v:shapetype id="_x0000_t32" coordsize="21600,21600" o:oned="t" filled="f" o:spt="32" path="m,l21600,21600e" w14:anchorId="2CBF1BFB">
               <v:path fillok="f" arrowok="t" o:connecttype="none"/>
@@ -1344,7 +1388,7 @@
             </wp:anchor>
           </w:drawing>
         </mc:Choice>
-        <mc:Fallback xmlns:a="http://schemas.openxmlformats.org/drawingml/2006/main" xmlns:arto="http://schemas.microsoft.com/office/word/2006/arto">
+        <mc:Fallback xmlns:arto="http://schemas.microsoft.com/office/word/2006/arto" xmlns:a="http://schemas.openxmlformats.org/drawingml/2006/main">
           <w:pict>
             <v:shape id="Straight Connector 2" style="position:absolute;margin-left:1.6pt;margin-top:.5pt;width:0;height:0;z-index:251661312;visibility:visible;mso-wrap-style:square;mso-wrap-distance-left:9pt;mso-wrap-distance-top:0;mso-wrap-distance-right:9pt;mso-wrap-distance-bottom:0;mso-position-horizontal:absolute;mso-position-horizontal-relative:margin;mso-position-vertical:absolute;mso-position-vertical-relative:text" o:spid="_x0000_s1026" strokeweight=".08811mm" type="#_x0000_t32" o:gfxdata="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" w14:anchorId="613E3343">
               <v:stroke joinstyle="miter"/>
@@ -1367,7 +1411,27 @@
         <w:sz w:val="16"/>
         <w:szCs w:val="16"/>
       </w:rPr>
-      <w:t>Historic England, 4th Floor, Cannon Bridge House, 25 Dowgate Hill, London EC4R 2YA</w:t>
+      <w:t xml:space="preserve">Historic England, 4th Floor, Cannon Bridge House, 25 </w:t>
+    </w:r>
+    <w:proofErr w:type="spellStart"/>
+    <w:r>
+      <w:rPr>
+        <w:b/>
+        <w:bCs/>
+        <w:sz w:val="16"/>
+        <w:szCs w:val="16"/>
+      </w:rPr>
+      <w:t>Dowgate</w:t>
+    </w:r>
+    <w:proofErr w:type="spellEnd"/>
+    <w:r>
+      <w:rPr>
+        <w:b/>
+        <w:bCs/>
+        <w:sz w:val="16"/>
+        <w:szCs w:val="16"/>
+      </w:rPr>
+      <w:t xml:space="preserve"> Hill, London EC4R 2YA</w:t>
     </w:r>
     <w:r>
       <w:rPr>
@@ -1383,7 +1447,23 @@
         <w:sz w:val="16"/>
         <w:szCs w:val="16"/>
       </w:rPr>
-      <w:t>Telephone 020 7973 3700  |  historicengland.org.uk</w:t>
+      <w:t xml:space="preserve">Telephone 020 7973 </w:t>
+    </w:r>
+    <w:proofErr w:type="gramStart"/>
+    <w:r>
+      <w:rPr>
+        <w:sz w:val="16"/>
+        <w:szCs w:val="16"/>
+      </w:rPr>
+      <w:t>3700  |</w:t>
+    </w:r>
+    <w:proofErr w:type="gramEnd"/>
+    <w:r>
+      <w:rPr>
+        <w:sz w:val="16"/>
+        <w:szCs w:val="16"/>
+      </w:rPr>
+      <w:t xml:space="preserve">  historicengland.org.uk</w:t>
     </w:r>
   </w:p>
   <w:p>
@@ -2860,6 +2940,16 @@
 </file>
 
 <file path=customXml/item1.xml><?xml version="1.0" encoding="utf-8"?>
+<p:properties xmlns:p="http://schemas.microsoft.com/office/2006/metadata/properties" xmlns:xsi="http://www.w3.org/2001/XMLSchema-instance" xmlns:pc="http://schemas.microsoft.com/office/infopath/2007/PartnerControls">
+  <documentManagement>
+    <lcf76f155ced4ddcb4097134ff3c332f xmlns="15cbe5fe-a4ea-4c05-b898-23c40f76a47d">
+      <Terms xmlns="http://schemas.microsoft.com/office/infopath/2007/PartnerControls"/>
+    </lcf76f155ced4ddcb4097134ff3c332f>
+  </documentManagement>
+</p:properties>
+</file>
+
+<file path=customXml/item2.xml><?xml version="1.0" encoding="utf-8"?>
 <ct:contentTypeSchema xmlns:ct="http://schemas.microsoft.com/office/2006/metadata/contentType" xmlns:ma="http://schemas.microsoft.com/office/2006/metadata/properties/metaAttributes" ct:_="" ma:_="" ma:contentTypeName="Document" ma:contentTypeID="0x010100C5565420FCD8C44E84101235CBEBD69B" ma:contentTypeVersion="8" ma:contentTypeDescription="Create a new document." ma:contentTypeScope="" ma:versionID="5ae0978ac079970eb89ee730d4f7bb62">
   <xsd:schema xmlns:xsd="http://www.w3.org/2001/XMLSchema" xmlns:xs="http://www.w3.org/2001/XMLSchema" xmlns:p="http://schemas.microsoft.com/office/2006/metadata/properties" xmlns:ns2="15cbe5fe-a4ea-4c05-b898-23c40f76a47d" targetNamespace="http://schemas.microsoft.com/office/2006/metadata/properties" ma:root="true" ma:fieldsID="58940ddf787972d6e3bd4503c168aeb5" ns2:_="">
     <xsd:import namespace="15cbe5fe-a4ea-4c05-b898-23c40f76a47d"/>
@@ -3023,16 +3113,6 @@
 </ct:contentTypeSchema>
 </file>
 
-<file path=customXml/item2.xml><?xml version="1.0" encoding="utf-8"?>
-<p:properties xmlns:p="http://schemas.microsoft.com/office/2006/metadata/properties" xmlns:xsi="http://www.w3.org/2001/XMLSchema-instance" xmlns:pc="http://schemas.microsoft.com/office/infopath/2007/PartnerControls">
-  <documentManagement>
-    <lcf76f155ced4ddcb4097134ff3c332f xmlns="15cbe5fe-a4ea-4c05-b898-23c40f76a47d">
-      <Terms xmlns="http://schemas.microsoft.com/office/infopath/2007/PartnerControls"/>
-    </lcf76f155ced4ddcb4097134ff3c332f>
-  </documentManagement>
-</p:properties>
-</file>
-
 <file path=customXml/item3.xml><?xml version="1.0" encoding="utf-8"?>
 <?mso-contentType ?>
 <FormTemplates xmlns="http://schemas.microsoft.com/sharepoint/v3/contenttype/forms">
@@ -3043,6 +3123,16 @@
 </file>
 
 <file path=customXml/itemProps1.xml><?xml version="1.0" encoding="utf-8"?>
+<ds:datastoreItem xmlns:ds="http://schemas.openxmlformats.org/officeDocument/2006/customXml" ds:itemID="{4E456FB0-4CA7-4355-8882-969D12BF7A1D}">
+  <ds:schemaRefs>
+    <ds:schemaRef ds:uri="http://schemas.microsoft.com/office/2006/metadata/properties"/>
+    <ds:schemaRef ds:uri="http://schemas.microsoft.com/office/infopath/2007/PartnerControls"/>
+    <ds:schemaRef ds:uri="15cbe5fe-a4ea-4c05-b898-23c40f76a47d"/>
+  </ds:schemaRefs>
+</ds:datastoreItem>
+</file>
+
+<file path=customXml/itemProps2.xml><?xml version="1.0" encoding="utf-8"?>
 <ds:datastoreItem xmlns:ds="http://schemas.openxmlformats.org/officeDocument/2006/customXml" ds:itemID="{B1A8F8A6-06CE-459D-B2DE-F6CEA2EE9D0E}">
   <ds:schemaRefs>
     <ds:schemaRef ds:uri="http://schemas.microsoft.com/office/2006/metadata/contentType"/>
@@ -3060,16 +3150,6 @@
 </ds:datastoreItem>
 </file>
 
-<file path=customXml/itemProps2.xml><?xml version="1.0" encoding="utf-8"?>
-<ds:datastoreItem xmlns:ds="http://schemas.openxmlformats.org/officeDocument/2006/customXml" ds:itemID="{4E456FB0-4CA7-4355-8882-969D12BF7A1D}">
-  <ds:schemaRefs>
-    <ds:schemaRef ds:uri="http://schemas.microsoft.com/office/2006/metadata/properties"/>
-    <ds:schemaRef ds:uri="http://schemas.microsoft.com/office/infopath/2007/PartnerControls"/>
-    <ds:schemaRef ds:uri="15cbe5fe-a4ea-4c05-b898-23c40f76a47d"/>
-  </ds:schemaRefs>
-</ds:datastoreItem>
-</file>
-
 <file path=customXml/itemProps3.xml><?xml version="1.0" encoding="utf-8"?>
 <ds:datastoreItem xmlns:ds="http://schemas.openxmlformats.org/officeDocument/2006/customXml" ds:itemID="{82CA82EA-5203-4622-B659-A52A37C0B2F5}">
   <ds:schemaRefs>

</xml_diff>

<commit_message>
Add yours sincerely and fix line breaks
</commit_message>
<xml_diff>
--- a/arches_her/docx/Opt out Implications Letter.docx
+++ b/arches_her/docx/Opt out Implications Letter.docx
@@ -966,21 +966,7 @@
         <w:rPr>
           <w:rFonts w:eastAsia="Arial"/>
         </w:rPr>
-        <w:t xml:space="preserve"> that heritage assets should be conserved in a manner appropriate to their significance, and that development proposals should </w:t>
-      </w:r>
-      <w:proofErr w:type="gramStart"/>
-      <w:r>
-        <w:rPr>
-          <w:rFonts w:eastAsia="Arial"/>
-        </w:rPr>
-        <w:t>take into account</w:t>
-      </w:r>
-      <w:proofErr w:type="gramEnd"/>
-      <w:r>
-        <w:rPr>
-          <w:rFonts w:eastAsia="Arial"/>
-        </w:rPr>
-        <w:t xml:space="preserve"> the positive contributions heritage assets can make to sustainable communities and to places.</w:t>
+        <w:t xml:space="preserve"> that heritage assets should be conserved in a manner appropriate to their significance, and that development proposals should take into account the positive contributions heritage assets can make to sustainable communities and to places.</w:t>
       </w:r>
     </w:p>
     <w:p>
@@ -1002,15 +988,7 @@
         <w:t>London Plan Policy HC1</w:t>
       </w:r>
       <w:r>
-        <w:t xml:space="preserve"> days that development proposals should avoid harm and identify enhancement opportunities by integrating heritage considerations </w:t>
-      </w:r>
-      <w:proofErr w:type="gramStart"/>
-      <w:r>
-        <w:t>early on in the</w:t>
-      </w:r>
-      <w:proofErr w:type="gramEnd"/>
-      <w:r>
-        <w:t xml:space="preserve"> design process.</w:t>
+        <w:t xml:space="preserve"> days that development proposals should avoid harm and identify enhancement opportunities by integrating heritage considerations early on in the design process.</w:t>
       </w:r>
     </w:p>
     <w:p>
@@ -1164,6 +1142,17 @@
         </w:tabs>
         <w:spacing w:after="0" w:line="240" w:lineRule="auto"/>
       </w:pPr>
+      <w:r>
+        <w:t>Yours sincerely</w:t>
+      </w:r>
+    </w:p>
+    <w:p>
+      <w:pPr>
+        <w:tabs>
+          <w:tab w:val="left" w:pos="5245"/>
+        </w:tabs>
+        <w:spacing w:after="0" w:line="240" w:lineRule="auto"/>
+      </w:pPr>
     </w:p>
     <w:p>
       <w:pPr>
@@ -1204,37 +1193,21 @@
           <w:b/>
           <w:bCs/>
         </w:rPr>
-        <w:t xml:space="preserve">London and </w:t>
-      </w:r>
-      <w:proofErr w:type="gramStart"/>
+        <w:t>London and South</w:t>
+      </w:r>
       <w:r>
         <w:rPr>
           <w:b/>
           <w:bCs/>
         </w:rPr>
-        <w:t>South</w:t>
+        <w:t xml:space="preserve"> </w:t>
       </w:r>
       <w:r>
         <w:rPr>
           <w:b/>
           <w:bCs/>
         </w:rPr>
-        <w:t xml:space="preserve"> </w:t>
-      </w:r>
-      <w:r>
-        <w:rPr>
-          <w:b/>
-          <w:bCs/>
-        </w:rPr>
-        <w:t>East</w:t>
-      </w:r>
-      <w:proofErr w:type="gramEnd"/>
-      <w:r>
-        <w:rPr>
-          <w:b/>
-          <w:bCs/>
-        </w:rPr>
-        <w:t xml:space="preserve"> Region</w:t>
+        <w:t>East Region</w:t>
       </w:r>
     </w:p>
     <w:p/>
@@ -1339,7 +1312,7 @@
             </wp:anchor>
           </w:drawing>
         </mc:Choice>
-        <mc:Fallback xmlns:arto="http://schemas.microsoft.com/office/word/2006/arto" xmlns:a="http://schemas.openxmlformats.org/drawingml/2006/main">
+        <mc:Fallback xmlns:a="http://schemas.openxmlformats.org/drawingml/2006/main" xmlns:arto="http://schemas.microsoft.com/office/word/2006/arto">
           <w:pict>
             <v:shapetype id="_x0000_t32" coordsize="21600,21600" o:oned="t" filled="f" o:spt="32" path="m,l21600,21600e" w14:anchorId="2CBF1BFB">
               <v:path fillok="f" arrowok="t" o:connecttype="none"/>
@@ -1404,7 +1377,7 @@
             </wp:anchor>
           </w:drawing>
         </mc:Choice>
-        <mc:Fallback xmlns:arto="http://schemas.microsoft.com/office/word/2006/arto" xmlns:a="http://schemas.openxmlformats.org/drawingml/2006/main">
+        <mc:Fallback xmlns:a="http://schemas.openxmlformats.org/drawingml/2006/main" xmlns:arto="http://schemas.microsoft.com/office/word/2006/arto">
           <w:pict>
             <v:shape id="Straight Connector 2" style="position:absolute;margin-left:1.6pt;margin-top:.5pt;width:0;height:0;z-index:251661312;visibility:visible;mso-wrap-style:square;mso-wrap-distance-left:9pt;mso-wrap-distance-top:0;mso-wrap-distance-right:9pt;mso-wrap-distance-bottom:0;mso-position-horizontal:absolute;mso-position-horizontal-relative:margin;mso-position-vertical:absolute;mso-position-vertical-relative:text" o:spid="_x0000_s1026" strokeweight=".08811mm" type="#_x0000_t32" o:gfxdata="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" w14:anchorId="613E3343">
               <v:stroke joinstyle="miter"/>
@@ -1463,23 +1436,7 @@
         <w:sz w:val="16"/>
         <w:szCs w:val="16"/>
       </w:rPr>
-      <w:t xml:space="preserve">Telephone 020 7973 </w:t>
-    </w:r>
-    <w:proofErr w:type="gramStart"/>
-    <w:r>
-      <w:rPr>
-        <w:sz w:val="16"/>
-        <w:szCs w:val="16"/>
-      </w:rPr>
-      <w:t>3700  |</w:t>
-    </w:r>
-    <w:proofErr w:type="gramEnd"/>
-    <w:r>
-      <w:rPr>
-        <w:sz w:val="16"/>
-        <w:szCs w:val="16"/>
-      </w:rPr>
-      <w:t xml:space="preserve">  historicengland.org.uk</w:t>
+      <w:t>Telephone 020 7973 3700  |  historicengland.org.uk</w:t>
     </w:r>
   </w:p>
   <w:p>
@@ -2991,25 +2948,6 @@
 </file>
 
 <file path=customXml/item1.xml><?xml version="1.0" encoding="utf-8"?>
-<?mso-contentType ?>
-<FormTemplates xmlns="http://schemas.microsoft.com/sharepoint/v3/contenttype/forms">
-  <Display>DocumentLibraryForm</Display>
-  <Edit>DocumentLibraryForm</Edit>
-  <New>DocumentLibraryForm</New>
-</FormTemplates>
-</file>
-
-<file path=customXml/item2.xml><?xml version="1.0" encoding="utf-8"?>
-<p:properties xmlns:p="http://schemas.microsoft.com/office/2006/metadata/properties" xmlns:xsi="http://www.w3.org/2001/XMLSchema-instance" xmlns:pc="http://schemas.microsoft.com/office/infopath/2007/PartnerControls">
-  <documentManagement>
-    <lcf76f155ced4ddcb4097134ff3c332f xmlns="15cbe5fe-a4ea-4c05-b898-23c40f76a47d">
-      <Terms xmlns="http://schemas.microsoft.com/office/infopath/2007/PartnerControls"/>
-    </lcf76f155ced4ddcb4097134ff3c332f>
-  </documentManagement>
-</p:properties>
-</file>
-
-<file path=customXml/item3.xml><?xml version="1.0" encoding="utf-8"?>
 <ct:contentTypeSchema xmlns:ct="http://schemas.microsoft.com/office/2006/metadata/contentType" xmlns:ma="http://schemas.microsoft.com/office/2006/metadata/properties/metaAttributes" ct:_="" ma:_="" ma:contentTypeName="Document" ma:contentTypeID="0x010100C5565420FCD8C44E84101235CBEBD69B" ma:contentTypeVersion="8" ma:contentTypeDescription="Create a new document." ma:contentTypeScope="" ma:versionID="5ae0978ac079970eb89ee730d4f7bb62">
   <xsd:schema xmlns:xsd="http://www.w3.org/2001/XMLSchema" xmlns:xs="http://www.w3.org/2001/XMLSchema" xmlns:p="http://schemas.microsoft.com/office/2006/metadata/properties" xmlns:ns2="15cbe5fe-a4ea-4c05-b898-23c40f76a47d" targetNamespace="http://schemas.microsoft.com/office/2006/metadata/properties" ma:root="true" ma:fieldsID="58940ddf787972d6e3bd4503c168aeb5" ns2:_="">
     <xsd:import namespace="15cbe5fe-a4ea-4c05-b898-23c40f76a47d"/>
@@ -3173,29 +3111,30 @@
 </ct:contentTypeSchema>
 </file>
 
+<file path=customXml/item2.xml><?xml version="1.0" encoding="utf-8"?>
+<p:properties xmlns:p="http://schemas.microsoft.com/office/2006/metadata/properties" xmlns:xsi="http://www.w3.org/2001/XMLSchema-instance" xmlns:pc="http://schemas.microsoft.com/office/infopath/2007/PartnerControls">
+  <documentManagement>
+    <lcf76f155ced4ddcb4097134ff3c332f xmlns="15cbe5fe-a4ea-4c05-b898-23c40f76a47d">
+      <Terms xmlns="http://schemas.microsoft.com/office/infopath/2007/PartnerControls"/>
+    </lcf76f155ced4ddcb4097134ff3c332f>
+  </documentManagement>
+</p:properties>
+</file>
+
+<file path=customXml/item3.xml><?xml version="1.0" encoding="utf-8"?>
+<?mso-contentType ?>
+<FormTemplates xmlns="http://schemas.microsoft.com/sharepoint/v3/contenttype/forms">
+  <Display>DocumentLibraryForm</Display>
+  <Edit>DocumentLibraryForm</Edit>
+  <New>DocumentLibraryForm</New>
+</FormTemplates>
+</file>
+
 <file path=customXml/item4.xml><?xml version="1.0" encoding="utf-8"?>
 <b:Sources xmlns:b="http://schemas.openxmlformats.org/officeDocument/2006/bibliography" xmlns="http://schemas.openxmlformats.org/officeDocument/2006/bibliography" SelectedStyle="\APASixthEditionOfficeOnline.xsl" StyleName="APA" Version="6"/>
 </file>
 
 <file path=customXml/itemProps1.xml><?xml version="1.0" encoding="utf-8"?>
-<ds:datastoreItem xmlns:ds="http://schemas.openxmlformats.org/officeDocument/2006/customXml" ds:itemID="{82CA82EA-5203-4622-B659-A52A37C0B2F5}">
-  <ds:schemaRefs>
-    <ds:schemaRef ds:uri="http://schemas.microsoft.com/sharepoint/v3/contenttype/forms"/>
-  </ds:schemaRefs>
-</ds:datastoreItem>
-</file>
-
-<file path=customXml/itemProps2.xml><?xml version="1.0" encoding="utf-8"?>
-<ds:datastoreItem xmlns:ds="http://schemas.openxmlformats.org/officeDocument/2006/customXml" ds:itemID="{4E456FB0-4CA7-4355-8882-969D12BF7A1D}">
-  <ds:schemaRefs>
-    <ds:schemaRef ds:uri="http://schemas.microsoft.com/office/2006/metadata/properties"/>
-    <ds:schemaRef ds:uri="http://schemas.microsoft.com/office/infopath/2007/PartnerControls"/>
-    <ds:schemaRef ds:uri="15cbe5fe-a4ea-4c05-b898-23c40f76a47d"/>
-  </ds:schemaRefs>
-</ds:datastoreItem>
-</file>
-
-<file path=customXml/itemProps3.xml><?xml version="1.0" encoding="utf-8"?>
 <ds:datastoreItem xmlns:ds="http://schemas.openxmlformats.org/officeDocument/2006/customXml" ds:itemID="{B1A8F8A6-06CE-459D-B2DE-F6CEA2EE9D0E}">
   <ds:schemaRefs>
     <ds:schemaRef ds:uri="http://schemas.microsoft.com/office/2006/metadata/contentType"/>
@@ -3213,6 +3152,24 @@
 </ds:datastoreItem>
 </file>
 
+<file path=customXml/itemProps2.xml><?xml version="1.0" encoding="utf-8"?>
+<ds:datastoreItem xmlns:ds="http://schemas.openxmlformats.org/officeDocument/2006/customXml" ds:itemID="{4E456FB0-4CA7-4355-8882-969D12BF7A1D}">
+  <ds:schemaRefs>
+    <ds:schemaRef ds:uri="http://schemas.microsoft.com/office/2006/metadata/properties"/>
+    <ds:schemaRef ds:uri="http://schemas.microsoft.com/office/infopath/2007/PartnerControls"/>
+    <ds:schemaRef ds:uri="15cbe5fe-a4ea-4c05-b898-23c40f76a47d"/>
+  </ds:schemaRefs>
+</ds:datastoreItem>
+</file>
+
+<file path=customXml/itemProps3.xml><?xml version="1.0" encoding="utf-8"?>
+<ds:datastoreItem xmlns:ds="http://schemas.openxmlformats.org/officeDocument/2006/customXml" ds:itemID="{82CA82EA-5203-4622-B659-A52A37C0B2F5}">
+  <ds:schemaRefs>
+    <ds:schemaRef ds:uri="http://schemas.microsoft.com/sharepoint/v3/contenttype/forms"/>
+  </ds:schemaRefs>
+</ds:datastoreItem>
+</file>
+
 <file path=customXml/itemProps4.xml><?xml version="1.0" encoding="utf-8"?>
 <ds:datastoreItem xmlns:ds="http://schemas.openxmlformats.org/officeDocument/2006/customXml" ds:itemID="{8322C042-2345-4A68-BD8F-0CF1DB313AF2}">
   <ds:schemaRefs>

</xml_diff>